<commit_message>
Add solution architecture diagram and embed into Word document
High-resolution PNG diagram showing all layers (Frontend, Backend API,
AI Agent, Data, External/Cloud) with swim-lane zones, component boxes,
data-flow arrows, and legend. Diagram appended to solution approach doc
as Appendix A with notes.

https://claude.ai/code/session_01UZkM3QGpG87ttWy7UVPKG8
</commit_message>
<xml_diff>
--- a/Contract_Negotiation_Agent_Solution_Approach.docx
+++ b/Contract_Negotiation_Agent_Solution_Approach.docx
@@ -4564,6 +4564,165 @@
       </w:tr>
     </w:tbl>
     <w:p/>
+    <w:p>
+      <w:r>
+        <w:br w:type="page"/>
+      </w:r>
+    </w:p>
+    <w:p>
+      <w:pPr>
+        <w:spacing w:before="360" w:after="80"/>
+      </w:pPr>
+      <w:r>
+        <w:rPr>
+          <w:b/>
+          <w:color w:val="1A2B4A"/>
+          <w:sz w:val="28"/>
+        </w:rPr>
+        <w:t>APPENDIX A — SOLUTION ARCHITECTURE DIAGRAM</w:t>
+      </w:r>
+    </w:p>
+    <w:p>
+      <w:pPr>
+        <w:pBdr>
+          <w:bottom w:val="single" w:sz="6" w:space="1" w:color="E86C1E"/>
+        </w:pBdr>
+        <w:spacing w:after="120" w:before="0"/>
+      </w:pPr>
+    </w:p>
+    <w:p>
+      <w:pPr>
+        <w:spacing w:before="120"/>
+        <w:jc w:val="center"/>
+      </w:pPr>
+      <w:r>
+        <w:rPr>
+          <w:b/>
+          <w:i/>
+          <w:color w:val="5A5A5A"/>
+          <w:sz w:val="18"/>
+        </w:rPr>
+        <w:t>Figure 1: Contract Negotiation Agent — High-Level Solution Architecture</w:t>
+      </w:r>
+    </w:p>
+    <w:p>
+      <w:pPr>
+        <w:spacing w:before="120" w:after="160"/>
+        <w:jc w:val="center"/>
+      </w:pPr>
+      <w:r>
+        <w:drawing>
+          <wp:inline xmlns:a="http://schemas.openxmlformats.org/drawingml/2006/main" xmlns:pic="http://schemas.openxmlformats.org/drawingml/2006/picture">
+            <wp:extent cx="6217920" cy="4365920"/>
+            <wp:docPr id="1" name="Picture 1"/>
+            <wp:cNvGraphicFramePr>
+              <a:graphicFrameLocks noChangeAspect="1"/>
+            </wp:cNvGraphicFramePr>
+            <a:graphic>
+              <a:graphicData uri="http://schemas.openxmlformats.org/drawingml/2006/picture">
+                <pic:pic>
+                  <pic:nvPicPr>
+                    <pic:cNvPr id="0" name="Contract_Negotiation_Agent_Architecture.png"/>
+                    <pic:cNvPicPr/>
+                  </pic:nvPicPr>
+                  <pic:blipFill>
+                    <a:blip r:embed="rId9"/>
+                    <a:stretch>
+                      <a:fillRect/>
+                    </a:stretch>
+                  </pic:blipFill>
+                  <pic:spPr>
+                    <a:xfrm>
+                      <a:off x="0" y="0"/>
+                      <a:ext cx="6217920" cy="4365920"/>
+                    </a:xfrm>
+                    <a:prstGeom prst="rect"/>
+                  </pic:spPr>
+                </pic:pic>
+              </a:graphicData>
+            </a:graphic>
+          </wp:inline>
+        </w:drawing>
+      </w:r>
+    </w:p>
+    <w:p>
+      <w:pPr>
+        <w:spacing w:before="160"/>
+      </w:pPr>
+      <w:r>
+        <w:rPr>
+          <w:b/>
+          <w:color w:val="E86C1E"/>
+          <w:sz w:val="20"/>
+        </w:rPr>
+        <w:t>Diagram Notes</w:t>
+      </w:r>
+    </w:p>
+    <w:p>
+      <w:pPr>
+        <w:pStyle w:val="ListBullet"/>
+        <w:spacing w:after="60"/>
+      </w:pPr>
+      <w:r>
+        <w:rPr>
+          <w:color w:val="5A5A5A"/>
+          <w:sz w:val="18"/>
+        </w:rPr>
+        <w:t>All frontend-to-backend communication is via REST over HTTPS.</w:t>
+      </w:r>
+    </w:p>
+    <w:p>
+      <w:pPr>
+        <w:pStyle w:val="ListBullet"/>
+        <w:spacing w:after="60"/>
+      </w:pPr>
+      <w:r>
+        <w:rPr>
+          <w:color w:val="5A5A5A"/>
+          <w:sz w:val="18"/>
+        </w:rPr>
+        <w:t>The AI Agent communicates with the Anthropic API (Claude Sonnet) using the tool-use pattern — Claude calls structured tools (extract_sow_data, lookup_benchmarks, save_feedback) rather than generating free-form responses for data operations.</w:t>
+      </w:r>
+    </w:p>
+    <w:p>
+      <w:pPr>
+        <w:pStyle w:val="ListBullet"/>
+        <w:spacing w:after="60"/>
+      </w:pPr>
+      <w:r>
+        <w:rPr>
+          <w:color w:val="5A5A5A"/>
+          <w:sz w:val="18"/>
+        </w:rPr>
+        <w:t>Session state is currently held in-memory on the backend process; a persistent store (e.g. PostgreSQL/Redis) is recommended for production.</w:t>
+      </w:r>
+    </w:p>
+    <w:p>
+      <w:pPr>
+        <w:pStyle w:val="ListBullet"/>
+        <w:spacing w:after="60"/>
+      </w:pPr>
+      <w:r>
+        <w:rPr>
+          <w:color w:val="5A5A5A"/>
+          <w:sz w:val="18"/>
+        </w:rPr>
+        <w:t>The Feedback Store (store.json) is read at session start to inject the last 8 sessions' learning context into the agent system prompt.</w:t>
+      </w:r>
+    </w:p>
+    <w:p>
+      <w:pPr>
+        <w:pStyle w:val="ListBullet"/>
+        <w:spacing w:after="60"/>
+      </w:pPr>
+      <w:r>
+        <w:rPr>
+          <w:color w:val="5A5A5A"/>
+          <w:sz w:val="18"/>
+        </w:rPr>
+        <w:t>Deployment targets: Backend → Railway.app (Docker), Frontend → Vercel (Next.js).</w:t>
+      </w:r>
+    </w:p>
     <w:sectPr>
       <w:pgSz w:w="12240" w:h="15840"/>
       <w:pgMar w:top="1417" w:right="1440" w:bottom="1417" w:left="1440" w:header="720" w:footer="720" w:gutter="0"/>

</xml_diff>